<commit_message>
Actualiza ESTADO, CLAUDE.md, plan, colaboracion, supuestos y el documento de traspaso (Word y PDF)
Co-Authored-By: Claude Sonnet 5.5 <noreply@anthropic.com>
</commit_message>
<xml_diff>
--- a/docs/TAPE_pasos_siguientes.docx
+++ b/docs/TAPE_pasos_siguientes.docx
@@ -45,7 +45,7 @@
         <w:rPr>
           <w:b w:val="0"/>
         </w:rPr>
-        <w:t>Documento de traspaso entre Joaquín Sostoa y su socio. Fecha: 9 de octubre de 2026. Se basa en docs/PLAN_fase0_fase1.md, docs/ESTADO.md y docs/COLABORACION.md del repositorio, que son la referencia vigente.</w:t>
+        <w:t>Documento de traspaso entre Joaquín Sostoa y su socio. Actualizado el 12 de octubre de 2026. Se basa en docs/ESTADO.md, docs/PLAN_fase0_fase1.md y docs/COLABORACION.md del repositorio, que son la referencia vigente.</w:t>
       </w:r>
     </w:p>
     <w:p>
@@ -71,7 +71,7 @@
         <w:spacing w:after="60"/>
       </w:pPr>
       <w:r>
-        <w:t>Fuentes internacionales descargables: BACI, Atlas de Complejidad, WDI, PWT, LPI, concordancias de la ONU, límites administrativos y 10 tablas de SIMEL.</w:t>
+        <w:t>Fuentes internacionales descargables: BACI, Atlas de Complejidad, WDI (15 indicadores), PWT, LPI, concordancias de la ONU, límites administrativos, 10 tablas de SIMEL, NBER-CES y la concordancia HS → NAICS.</w:t>
       </w:r>
     </w:p>
     <w:p>
@@ -80,7 +80,7 @@
         <w:spacing w:after="60"/>
       </w:pPr>
       <w:r>
-        <w:t>Fuentes nacionales ya incorporadas: PIB por 33 actividades y regional (BCP), crédito por sector, MIP de 21 sectores, EPHC 2022–2025, censo agropecuario 2022 (por departamento y por distrito), carreras de la ANEAES, establecimientos del MEC y siete capas del mapa logístico del MIC (población y PEA por distrito, industrias, red eléctrica, rutas, polos y AFI, aduanas, salud).</w:t>
+        <w:t>Fuentes nacionales ya incorporadas: PIB por 33 actividades y regional (BCP), crédito por sector, MIP de 21 sectores, EPHC 2022–2025, censo agropecuario 2022 (por departamento y por distrito), carreras de la ANEAES, establecimientos del MEC y siete capas del mapa logístico del MIC.</w:t>
       </w:r>
     </w:p>
     <w:p>
@@ -89,7 +89,16 @@
         <w:spacing w:after="60"/>
       </w:pPr>
       <w:r>
-        <w:t>Fase 1 (módulo nacional): sin empezar. Pasan 95 pruebas automáticas.</w:t>
+        <w:t>Fase 1 (módulo nacional) en marcha: hechas la tarea 1.5 (dotaciones por país) y la 1.6 (requisitos por producto). Ever subió borradores de las tareas 1.2, 1.3, 1.4, 1.7 y 1.8 en src/modelos/. Pasan 125 pruebas.</w:t>
+      </w:r>
+    </w:p>
+    <w:p>
+      <w:pPr>
+        <w:pStyle w:val="ListBullet"/>
+        <w:spacing w:after="60"/>
+      </w:pPr>
+      <w:r>
+        <w:t>Decisiones tomadas el 12 de octubre: D3 (proximidad con ventana de 5 años), D4 (intensidades con NBER-CES y energía con el precio de la electricidad) y D6 (reexportaciones marcadas por regla automática).</w:t>
       </w:r>
     </w:p>
     <w:p>
@@ -208,15 +217,7 @@
         <w:pStyle w:val="Heading1"/>
       </w:pPr>
       <w:r>
-        <w:t>3. Tareas que se pueden hacer ya, sin decisiones previas</w:t>
-      </w:r>
-    </w:p>
-    <w:p>
-      <w:r>
-        <w:rPr>
-          <w:b w:val="0"/>
-        </w:rPr>
-        <w:t>Son tareas de código con un criterio de terminado claro. Cada una cierra con un resumen, una tabla o gráfico de control y un commit.</w:t>
+        <w:t>3. Estado de las tareas de la Fase 1</w:t>
       </w:r>
     </w:p>
     <w:tbl>
@@ -238,7 +239,7 @@
         </w:trPr>
         <w:tc>
           <w:tcPr>
-            <w:tcW w:type="dxa" w:w="2268"/>
+            <w:tcW w:type="dxa" w:w="1474"/>
             <w:shd w:val="clear" w:color="auto" w:fill="1F4E79"/>
           </w:tcPr>
           <w:p>
@@ -257,7 +258,7 @@
         </w:tc>
         <w:tc>
           <w:tcPr>
-            <w:tcW w:type="dxa" w:w="5102"/>
+            <w:tcW w:type="dxa" w:w="4762"/>
             <w:shd w:val="clear" w:color="auto" w:fill="1F4E79"/>
           </w:tcPr>
           <w:p>
@@ -270,13 +271,13 @@
                 <w:color w:val="FFFFFF"/>
                 <w:sz w:val="20"/>
               </w:rPr>
-              <w:t>Qué hace</w:t>
+              <w:t>Estado</w:t>
             </w:r>
           </w:p>
         </w:tc>
         <w:tc>
           <w:tcPr>
-            <w:tcW w:type="dxa" w:w="2268"/>
+            <w:tcW w:type="dxa" w:w="3402"/>
             <w:shd w:val="clear" w:color="auto" w:fill="1F4E79"/>
           </w:tcPr>
           <w:p>
@@ -289,15 +290,18 @@
                 <w:color w:val="FFFFFF"/>
                 <w:sz w:val="20"/>
               </w:rPr>
-              <w:t>Depende de</w:t>
+              <w:t>Qué falta</w:t>
             </w:r>
           </w:p>
         </w:tc>
       </w:tr>
       <w:tr>
+        <w:trPr>
+          <w:cantSplit w:val="true"/>
+        </w:trPr>
         <w:tc>
           <w:tcPr>
-            <w:tcW w:type="dxa" w:w="2268"/>
+            <w:tcW w:type="dxa" w:w="1474"/>
           </w:tcPr>
           <w:p>
             <w:pPr>
@@ -314,7 +318,7 @@
         </w:tc>
         <w:tc>
           <w:tcPr>
-            <w:tcW w:type="dxa" w:w="5102"/>
+            <w:tcW w:type="dxa" w:w="4762"/>
           </w:tcPr>
           <w:p>
             <w:pPr>
@@ -325,13 +329,13 @@
                 <w:b w:val="0"/>
                 <w:sz w:val="20"/>
               </w:rPr>
-              <w:t>Lee el zip de BACI sin extraerlo y deja data/clean/comercio_hs92.parquet con país, socio, producto, año, valor y toneladas.</w:t>
+              <w:t>El borrador de Ever trabaja sobre su base DuckDB</w:t>
             </w:r>
           </w:p>
         </w:tc>
         <w:tc>
           <w:tcPr>
-            <w:tcW w:type="dxa" w:w="2268"/>
+            <w:tcW w:type="dxa" w:w="3402"/>
           </w:tcPr>
           <w:p>
             <w:pPr>
@@ -342,16 +346,77 @@
                 <w:b w:val="0"/>
                 <w:sz w:val="20"/>
               </w:rPr>
-              <w:t>Nada</w:t>
+              <w:t>Reproducible desde el repositorio</w:t>
             </w:r>
           </w:p>
         </w:tc>
       </w:tr>
       <w:tr>
+        <w:trPr>
+          <w:cantSplit w:val="true"/>
+        </w:trPr>
         <w:tc>
           <w:tcPr>
-            <w:tcW w:type="dxa" w:w="2268"/>
+            <w:tcW w:type="dxa" w:w="1474"/>
             <w:shd w:val="clear" w:color="auto" w:fill="F2F2F2"/>
+          </w:tcPr>
+          <w:p>
+            <w:pPr>
+              <w:spacing w:after="40"/>
+            </w:pPr>
+            <w:r>
+              <w:rPr>
+                <w:b/>
+                <w:sz w:val="20"/>
+              </w:rPr>
+              <w:t>1.2 Depuración</w:t>
+            </w:r>
+          </w:p>
+        </w:tc>
+        <w:tc>
+          <w:tcPr>
+            <w:tcW w:type="dxa" w:w="4762"/>
+            <w:shd w:val="clear" w:color="auto" w:fill="F2F2F2"/>
+          </w:tcPr>
+          <w:p>
+            <w:pPr>
+              <w:spacing w:after="40"/>
+            </w:pPr>
+            <w:r>
+              <w:rPr>
+                <w:b w:val="0"/>
+                <w:sz w:val="20"/>
+              </w:rPr>
+              <w:t>Borrador de Ever (energía HS 271600 y reexportaciones)</w:t>
+            </w:r>
+          </w:p>
+        </w:tc>
+        <w:tc>
+          <w:tcPr>
+            <w:tcW w:type="dxa" w:w="3402"/>
+            <w:shd w:val="clear" w:color="auto" w:fill="F2F2F2"/>
+          </w:tcPr>
+          <w:p>
+            <w:pPr>
+              <w:spacing w:after="40"/>
+            </w:pPr>
+            <w:r>
+              <w:rPr>
+                <w:b w:val="0"/>
+                <w:sz w:val="20"/>
+              </w:rPr>
+              <w:t>Recalcular el RCA después de depurar; aplicar la depuración a la presencia y la densidad</w:t>
+            </w:r>
+          </w:p>
+        </w:tc>
+      </w:tr>
+      <w:tr>
+        <w:trPr>
+          <w:cantSplit w:val="true"/>
+        </w:trPr>
+        <w:tc>
+          <w:tcPr>
+            <w:tcW w:type="dxa" w:w="1474"/>
           </w:tcPr>
           <w:p>
             <w:pPr>
@@ -368,7 +433,64 @@
         </w:tc>
         <w:tc>
           <w:tcPr>
-            <w:tcW w:type="dxa" w:w="5102"/>
+            <w:tcW w:type="dxa" w:w="4762"/>
+          </w:tcPr>
+          <w:p>
+            <w:pPr>
+              <w:spacing w:after="40"/>
+            </w:pPr>
+            <w:r>
+              <w:rPr>
+                <w:b w:val="0"/>
+                <w:sz w:val="20"/>
+              </w:rPr>
+              <w:t>Borrador de Ever (presencia con promedio móvil de 3 años)</w:t>
+            </w:r>
+          </w:p>
+        </w:tc>
+        <w:tc>
+          <w:tcPr>
+            <w:tcW w:type="dxa" w:w="3402"/>
+          </w:tcPr>
+          <w:p>
+            <w:pPr>
+              <w:spacing w:after="40"/>
+            </w:pPr>
+            <w:r>
+              <w:rPr>
+                <w:b w:val="0"/>
+                <w:sz w:val="20"/>
+              </w:rPr>
+              <w:t>Contrastar con el RCA del Atlas; D7 sin decidir</w:t>
+            </w:r>
+          </w:p>
+        </w:tc>
+      </w:tr>
+      <w:tr>
+        <w:trPr>
+          <w:cantSplit w:val="true"/>
+        </w:trPr>
+        <w:tc>
+          <w:tcPr>
+            <w:tcW w:type="dxa" w:w="1474"/>
+            <w:shd w:val="clear" w:color="auto" w:fill="F2F2F2"/>
+          </w:tcPr>
+          <w:p>
+            <w:pPr>
+              <w:spacing w:after="40"/>
+            </w:pPr>
+            <w:r>
+              <w:rPr>
+                <w:b/>
+                <w:sz w:val="20"/>
+              </w:rPr>
+              <w:t>1.4 Proximidad y densidad</w:t>
+            </w:r>
+          </w:p>
+        </w:tc>
+        <w:tc>
+          <w:tcPr>
+            <w:tcW w:type="dxa" w:w="4762"/>
             <w:shd w:val="clear" w:color="auto" w:fill="F2F2F2"/>
           </w:tcPr>
           <w:p>
@@ -380,13 +502,13 @@
                 <w:b w:val="0"/>
                 <w:sz w:val="20"/>
               </w:rPr>
-              <w:t>Funciones puras con un ejemplo hecho a mano. Se contrasta con el RCA del Atlas (correlación esperada mayor a 0,99).</w:t>
+              <w:t>Borrador de Ever; versión liviana hecha (densidad_np.py)</w:t>
             </w:r>
           </w:p>
         </w:tc>
         <w:tc>
           <w:tcPr>
-            <w:tcW w:type="dxa" w:w="2268"/>
+            <w:tcW w:type="dxa" w:w="3402"/>
             <w:shd w:val="clear" w:color="auto" w:fill="F2F2F2"/>
           </w:tcPr>
           <w:p>
@@ -398,15 +520,18 @@
                 <w:b w:val="0"/>
                 <w:sz w:val="20"/>
               </w:rPr>
-              <w:t>1.1</w:t>
+              <w:t>Pasar a la versión liviana; contrastar con la distancia del Atlas</w:t>
             </w:r>
           </w:p>
         </w:tc>
       </w:tr>
       <w:tr>
+        <w:trPr>
+          <w:cantSplit w:val="true"/>
+        </w:trPr>
         <w:tc>
           <w:tcPr>
-            <w:tcW w:type="dxa" w:w="2268"/>
+            <w:tcW w:type="dxa" w:w="1474"/>
           </w:tcPr>
           <w:p>
             <w:pPr>
@@ -417,13 +542,13 @@
                 <w:b/>
                 <w:sz w:val="20"/>
               </w:rPr>
-              <w:t>1.8 Métricas de evaluación</w:t>
+              <w:t>1.5 Dotaciones por país</w:t>
             </w:r>
           </w:p>
         </w:tc>
         <w:tc>
           <w:tcPr>
-            <w:tcW w:type="dxa" w:w="5102"/>
+            <w:tcW w:type="dxa" w:w="4762"/>
           </w:tcPr>
           <w:p>
             <w:pPr>
@@ -434,13 +559,13 @@
                 <w:b w:val="0"/>
                 <w:sz w:val="20"/>
               </w:rPr>
-              <w:t>precision@k, AUC-PR y calibración, cada una con una prueba mínima. Es el piso contra el que se compara todo.</w:t>
+              <w:t>HECHA (docs/dotaciones.md)</w:t>
             </w:r>
           </w:p>
         </w:tc>
         <w:tc>
           <w:tcPr>
-            <w:tcW w:type="dxa" w:w="2268"/>
+            <w:tcW w:type="dxa" w:w="3402"/>
           </w:tcPr>
           <w:p>
             <w:pPr>
@@ -451,15 +576,18 @@
                 <w:b w:val="0"/>
                 <w:sz w:val="20"/>
               </w:rPr>
-              <w:t>Nada</w:t>
+              <w:t>—</w:t>
             </w:r>
           </w:p>
         </w:tc>
       </w:tr>
       <w:tr>
+        <w:trPr>
+          <w:cantSplit w:val="true"/>
+        </w:trPr>
         <w:tc>
           <w:tcPr>
-            <w:tcW w:type="dxa" w:w="2268"/>
+            <w:tcW w:type="dxa" w:w="1474"/>
             <w:shd w:val="clear" w:color="auto" w:fill="F2F2F2"/>
           </w:tcPr>
           <w:p>
@@ -471,13 +599,13 @@
                 <w:b/>
                 <w:sz w:val="20"/>
               </w:rPr>
-              <w:t>1.5 Dotaciones (parte)</w:t>
+              <w:t>1.6 Requisitos por producto</w:t>
             </w:r>
           </w:p>
         </w:tc>
         <w:tc>
           <w:tcPr>
-            <w:tcW w:type="dxa" w:w="5102"/>
+            <w:tcW w:type="dxa" w:w="4762"/>
             <w:shd w:val="clear" w:color="auto" w:fill="F2F2F2"/>
           </w:tcPr>
           <w:p>
@@ -489,13 +617,13 @@
                 <w:b w:val="0"/>
                 <w:sz w:val="20"/>
               </w:rPr>
-              <w:t>Capital humano, crédito y logística por país y año, desde WDI, PWT y LPI. La energía espera D4.</w:t>
+              <w:t>HECHA (docs/puente_requisitos.md)</w:t>
             </w:r>
           </w:p>
         </w:tc>
         <w:tc>
           <w:tcPr>
-            <w:tcW w:type="dxa" w:w="2268"/>
+            <w:tcW w:type="dxa" w:w="3402"/>
             <w:shd w:val="clear" w:color="auto" w:fill="F2F2F2"/>
           </w:tcPr>
           <w:p>
@@ -507,7 +635,178 @@
                 <w:b w:val="0"/>
                 <w:sz w:val="20"/>
               </w:rPr>
-              <w:t>Nada</w:t>
+              <w:t>Decidir qué hacer con agro, minería y servicios (sin dato)</w:t>
+            </w:r>
+          </w:p>
+        </w:tc>
+      </w:tr>
+      <w:tr>
+        <w:trPr>
+          <w:cantSplit w:val="true"/>
+        </w:trPr>
+        <w:tc>
+          <w:tcPr>
+            <w:tcW w:type="dxa" w:w="1474"/>
+          </w:tcPr>
+          <w:p>
+            <w:pPr>
+              <w:spacing w:after="40"/>
+            </w:pPr>
+            <w:r>
+              <w:rPr>
+                <w:b/>
+                <w:sz w:val="20"/>
+              </w:rPr>
+              <w:t>1.7 Panel de entradas</w:t>
+            </w:r>
+          </w:p>
+        </w:tc>
+        <w:tc>
+          <w:tcPr>
+            <w:tcW w:type="dxa" w:w="4762"/>
+          </w:tcPr>
+          <w:p>
+            <w:pPr>
+              <w:spacing w:after="40"/>
+            </w:pPr>
+            <w:r>
+              <w:rPr>
+                <w:b w:val="0"/>
+                <w:sz w:val="20"/>
+              </w:rPr>
+              <w:t>Borrador de Ever</w:t>
+            </w:r>
+          </w:p>
+        </w:tc>
+        <w:tc>
+          <w:tcPr>
+            <w:tcW w:type="dxa" w:w="3402"/>
+          </w:tcPr>
+          <w:p>
+            <w:pPr>
+              <w:spacing w:after="40"/>
+            </w:pPr>
+            <w:r>
+              <w:rPr>
+                <w:b w:val="0"/>
+                <w:sz w:val="20"/>
+              </w:rPr>
+              <w:t>D7 y D8 sin decidir; sus constantes de D8 no se aplican</w:t>
+            </w:r>
+          </w:p>
+        </w:tc>
+      </w:tr>
+      <w:tr>
+        <w:trPr>
+          <w:cantSplit w:val="true"/>
+        </w:trPr>
+        <w:tc>
+          <w:tcPr>
+            <w:tcW w:type="dxa" w:w="1474"/>
+            <w:shd w:val="clear" w:color="auto" w:fill="F2F2F2"/>
+          </w:tcPr>
+          <w:p>
+            <w:pPr>
+              <w:spacing w:after="40"/>
+            </w:pPr>
+            <w:r>
+              <w:rPr>
+                <w:b/>
+                <w:sz w:val="20"/>
+              </w:rPr>
+              <w:t>1.8 Modelo de densidad sola</w:t>
+            </w:r>
+          </w:p>
+        </w:tc>
+        <w:tc>
+          <w:tcPr>
+            <w:tcW w:type="dxa" w:w="4762"/>
+            <w:shd w:val="clear" w:color="auto" w:fill="F2F2F2"/>
+          </w:tcPr>
+          <w:p>
+            <w:pPr>
+              <w:spacing w:after="40"/>
+            </w:pPr>
+            <w:r>
+              <w:rPr>
+                <w:b w:val="0"/>
+                <w:sz w:val="20"/>
+              </w:rPr>
+              <w:t>Borrador de Ever; versión liviana del logit hecha (logit_disperso.py)</w:t>
+            </w:r>
+          </w:p>
+        </w:tc>
+        <w:tc>
+          <w:tcPr>
+            <w:tcW w:type="dxa" w:w="3402"/>
+            <w:shd w:val="clear" w:color="auto" w:fill="F2F2F2"/>
+          </w:tcPr>
+          <w:p>
+            <w:pPr>
+              <w:spacing w:after="40"/>
+            </w:pPr>
+            <w:r>
+              <w:rPr>
+                <w:b w:val="0"/>
+                <w:sz w:val="20"/>
+              </w:rPr>
+              <w:t>Pasar a la versión liviana</w:t>
+            </w:r>
+          </w:p>
+        </w:tc>
+      </w:tr>
+      <w:tr>
+        <w:trPr>
+          <w:cantSplit w:val="true"/>
+        </w:trPr>
+        <w:tc>
+          <w:tcPr>
+            <w:tcW w:type="dxa" w:w="1474"/>
+          </w:tcPr>
+          <w:p>
+            <w:pPr>
+              <w:spacing w:after="40"/>
+            </w:pPr>
+            <w:r>
+              <w:rPr>
+                <w:b/>
+                <w:sz w:val="20"/>
+              </w:rPr>
+              <w:t>1.9 a 1.11</w:t>
+            </w:r>
+          </w:p>
+        </w:tc>
+        <w:tc>
+          <w:tcPr>
+            <w:tcW w:type="dxa" w:w="4762"/>
+          </w:tcPr>
+          <w:p>
+            <w:pPr>
+              <w:spacing w:after="40"/>
+            </w:pPr>
+            <w:r>
+              <w:rPr>
+                <w:b w:val="0"/>
+                <w:sz w:val="20"/>
+              </w:rPr>
+              <w:t>Pendientes</w:t>
+            </w:r>
+          </w:p>
+        </w:tc>
+        <w:tc>
+          <w:tcPr>
+            <w:tcW w:type="dxa" w:w="3402"/>
+          </w:tcPr>
+          <w:p>
+            <w:pPr>
+              <w:spacing w:after="40"/>
+            </w:pPr>
+            <w:r>
+              <w:rPr>
+                <w:b w:val="0"/>
+                <w:sz w:val="20"/>
+              </w:rPr>
+              <w:t>D2 para el logit y D1 para el informe</w:t>
             </w:r>
           </w:p>
         </w:tc>
@@ -523,15 +822,89 @@
         <w:pStyle w:val="Heading1"/>
       </w:pPr>
       <w:r>
-        <w:t>4. Decisiones que hay que tomar entre los dos</w:t>
+        <w:t>4. Decisiones</w:t>
       </w:r>
     </w:p>
     <w:p>
+      <w:pPr>
+        <w:spacing w:after="60"/>
+      </w:pPr>
       <w:r>
         <w:rPr>
           <w:b w:val="0"/>
         </w:rPr>
-        <w:t>De la más urgente a la menos urgente. La recomendación es la propuesta del plan; cada decisión se anota en docs/supuestos.md con fecha y alternativa descartada.</w:t>
+        <w:t>Decididas el 12 de octubre de 2026 (detalle en docs/supuestos.md):</w:t>
+      </w:r>
+    </w:p>
+    <w:p>
+      <w:pPr>
+        <w:pStyle w:val="ListBullet"/>
+        <w:spacing w:after="60"/>
+      </w:pPr>
+      <w:r>
+        <w:rPr>
+          <w:b/>
+        </w:rPr>
+        <w:t xml:space="preserve">D3: </w:t>
+      </w:r>
+      <w:r>
+        <w:t>proximidad entre productos con ventana de 5 años que termina en el año de corte; la distancia del Atlas solo sirve de control.</w:t>
+      </w:r>
+    </w:p>
+    <w:p>
+      <w:pPr>
+        <w:pStyle w:val="ListBullet"/>
+        <w:spacing w:after="60"/>
+      </w:pPr>
+      <w:r>
+        <w:rPr>
+          <w:b/>
+        </w:rPr>
+        <w:t xml:space="preserve">D4: </w:t>
+      </w:r>
+      <w:r>
+        <w:t>intensidades por producto con NBER-CES y la tabla NAICS → HS de Pierce y Schott; energía = precio de la electricidad (Doing Business, promedio 2014-2019).</w:t>
+      </w:r>
+    </w:p>
+    <w:p>
+      <w:pPr>
+        <w:pStyle w:val="ListBullet"/>
+        <w:spacing w:after="60"/>
+      </w:pPr>
+      <w:r>
+        <w:rPr>
+          <w:b/>
+        </w:rPr>
+        <w:t xml:space="preserve">D6: </w:t>
+      </w:r>
+      <w:r>
+        <w:t>reexportaciones de Paraguay marcadas con una regla automática (importaciones y exportaciones del mismo orden), a revisar después con la aduana.</w:t>
+      </w:r>
+    </w:p>
+    <w:p>
+      <w:pPr>
+        <w:pStyle w:val="ListBullet"/>
+        <w:spacing w:after="60"/>
+      </w:pPr>
+      <w:r>
+        <w:rPr>
+          <w:b/>
+        </w:rPr>
+        <w:t xml:space="preserve">Decididas antes: </w:t>
+      </w:r>
+      <w:r>
+        <w:t>D5 (HS92; 4 dígitos para estimar y 6 para el puente), D9, D11 y D12.</w:t>
+      </w:r>
+    </w:p>
+    <w:p>
+      <w:pPr>
+        <w:spacing w:before="160"/>
+      </w:pPr>
+      <w:r>
+        <w:rPr>
+          <w:b w:val="0"/>
+        </w:rPr>
+        <w:t>Siguen abiertas, de la más urgente a la menos urgente. La recomendación es la propuesta del plan:</w:t>
       </w:r>
     </w:p>
     <w:tbl>
@@ -630,6 +1003,9 @@
         </w:tc>
       </w:tr>
       <w:tr>
+        <w:trPr>
+          <w:cantSplit w:val="true"/>
+        </w:trPr>
         <w:tc>
           <w:tcPr>
             <w:tcW w:type="dxa" w:w="737"/>
@@ -643,7 +1019,7 @@
                 <w:b/>
                 <w:sz w:val="20"/>
               </w:rPr>
-              <w:t>D4</w:t>
+              <w:t>D7</w:t>
             </w:r>
           </w:p>
         </w:tc>
@@ -660,7 +1036,7 @@
                 <w:b w:val="0"/>
                 <w:sz w:val="20"/>
               </w:rPr>
-              <w:t>Fuente de las intensidades por producto (energía, capital, habilidades) y del costo de energía</w:t>
+              <w:t>Definición de entrada sostenida</w:t>
             </w:r>
           </w:p>
         </w:tc>
@@ -677,7 +1053,7 @@
                 <w:b w:val="0"/>
                 <w:sz w:val="20"/>
               </w:rPr>
-              <w:t>1.5 y 1.6</w:t>
+              <w:t>1.7</w:t>
             </w:r>
           </w:p>
         </w:tc>
@@ -694,12 +1070,15 @@
                 <w:b w:val="0"/>
                 <w:sz w:val="20"/>
               </w:rPr>
-              <w:t>Intensidades con NBER-CES; energía con un proxy de WDI al inicio. Es la capa más débil con datos públicos.</w:t>
+              <w:t>RCA con promedio móvil de 3 años, y una variante que exige RCA ≥ 1 en dos de tres años. Ever ya implementó la primera.</w:t>
             </w:r>
           </w:p>
         </w:tc>
       </w:tr>
       <w:tr>
+        <w:trPr>
+          <w:cantSplit w:val="true"/>
+        </w:trPr>
         <w:tc>
           <w:tcPr>
             <w:tcW w:type="dxa" w:w="737"/>
@@ -714,7 +1093,7 @@
                 <w:b/>
                 <w:sz w:val="20"/>
               </w:rPr>
-              <w:t>D6</w:t>
+              <w:t>D8</w:t>
             </w:r>
           </w:p>
         </w:tc>
@@ -732,151 +1111,7 @@
                 <w:b w:val="0"/>
                 <w:sz w:val="20"/>
               </w:rPr>
-              <w:t>Cómo marcar las reexportaciones de Paraguay</w:t>
-            </w:r>
-          </w:p>
-        </w:tc>
-        <w:tc>
-          <w:tcPr>
-            <w:tcW w:type="dxa" w:w="1361"/>
-            <w:shd w:val="clear" w:color="auto" w:fill="F2F2F2"/>
-          </w:tcPr>
-          <w:p>
-            <w:pPr>
-              <w:spacing w:after="40"/>
-            </w:pPr>
-            <w:r>
-              <w:rPr>
-                <w:b w:val="0"/>
-                <w:sz w:val="20"/>
-              </w:rPr>
-              <w:t>1.2</w:t>
-            </w:r>
-          </w:p>
-        </w:tc>
-        <w:tc>
-          <w:tcPr>
-            <w:tcW w:type="dxa" w:w="4309"/>
-            <w:shd w:val="clear" w:color="auto" w:fill="F2F2F2"/>
-          </w:tcPr>
-          <w:p>
-            <w:pPr>
-              <w:spacing w:after="40"/>
-            </w:pPr>
-            <w:r>
-              <w:rPr>
-                <w:b w:val="0"/>
-                <w:sz w:val="20"/>
-              </w:rPr>
-              <w:t>Marcar productos con importaciones y exportaciones del mismo orden y confirmar luego con la aduana.</w:t>
-            </w:r>
-          </w:p>
-        </w:tc>
-      </w:tr>
-      <w:tr>
-        <w:tc>
-          <w:tcPr>
-            <w:tcW w:type="dxa" w:w="737"/>
-          </w:tcPr>
-          <w:p>
-            <w:pPr>
-              <w:spacing w:after="40"/>
-            </w:pPr>
-            <w:r>
-              <w:rPr>
-                <w:b/>
-                <w:sz w:val="20"/>
-              </w:rPr>
-              <w:t>D3</w:t>
-            </w:r>
-          </w:p>
-        </w:tc>
-        <w:tc>
-          <w:tcPr>
-            <w:tcW w:type="dxa" w:w="3231"/>
-          </w:tcPr>
-          <w:p>
-            <w:pPr>
-              <w:spacing w:after="40"/>
-            </w:pPr>
-            <w:r>
-              <w:rPr>
-                <w:b w:val="0"/>
-                <w:sz w:val="20"/>
-              </w:rPr>
-              <w:t>Cómo calcular la proximidad entre productos sin fuga de información</w:t>
-            </w:r>
-          </w:p>
-        </w:tc>
-        <w:tc>
-          <w:tcPr>
-            <w:tcW w:type="dxa" w:w="1361"/>
-          </w:tcPr>
-          <w:p>
-            <w:pPr>
-              <w:spacing w:after="40"/>
-            </w:pPr>
-            <w:r>
-              <w:rPr>
-                <w:b w:val="0"/>
-                <w:sz w:val="20"/>
-              </w:rPr>
-              <w:t>1.4</w:t>
-            </w:r>
-          </w:p>
-        </w:tc>
-        <w:tc>
-          <w:tcPr>
-            <w:tcW w:type="dxa" w:w="4309"/>
-          </w:tcPr>
-          <w:p>
-            <w:pPr>
-              <w:spacing w:after="40"/>
-            </w:pPr>
-            <w:r>
-              <w:rPr>
-                <w:b w:val="0"/>
-                <w:sz w:val="20"/>
-              </w:rPr>
-              <w:t>Ventana de 5 años que termina en el año de corte.</w:t>
-            </w:r>
-          </w:p>
-        </w:tc>
-      </w:tr>
-      <w:tr>
-        <w:tc>
-          <w:tcPr>
-            <w:tcW w:type="dxa" w:w="737"/>
-            <w:shd w:val="clear" w:color="auto" w:fill="F2F2F2"/>
-          </w:tcPr>
-          <w:p>
-            <w:pPr>
-              <w:spacing w:after="40"/>
-            </w:pPr>
-            <w:r>
-              <w:rPr>
-                <w:b/>
-                <w:sz w:val="20"/>
-              </w:rPr>
-              <w:t>D7</w:t>
-            </w:r>
-          </w:p>
-        </w:tc>
-        <w:tc>
-          <w:tcPr>
-            <w:tcW w:type="dxa" w:w="3231"/>
-            <w:shd w:val="clear" w:color="auto" w:fill="F2F2F2"/>
-          </w:tcPr>
-          <w:p>
-            <w:pPr>
-              <w:spacing w:after="40"/>
-            </w:pPr>
-            <w:r>
-              <w:rPr>
-                <w:b w:val="0"/>
-                <w:sz w:val="20"/>
-              </w:rPr>
-              <w:t>Definición de entrada sostenida</w:t>
+              <w:t>Muestra de países</w:t>
             </w:r>
           </w:p>
         </w:tc>
@@ -912,86 +1147,18 @@
                 <w:b w:val="0"/>
                 <w:sz w:val="20"/>
               </w:rPr>
-              <w:t>RCA con promedio móvil de 3 años, y una variante que exige RCA ≥ 1 en dos de tres años.</w:t>
-            </w:r>
-          </w:p>
-        </w:tc>
-      </w:tr>
-      <w:tr>
-        <w:tc>
-          <w:tcPr>
-            <w:tcW w:type="dxa" w:w="737"/>
-          </w:tcPr>
-          <w:p>
-            <w:pPr>
-              <w:spacing w:after="40"/>
-            </w:pPr>
-            <w:r>
-              <w:rPr>
-                <w:b/>
-                <w:sz w:val="20"/>
-              </w:rPr>
-              <w:t>D8</w:t>
-            </w:r>
-          </w:p>
-        </w:tc>
-        <w:tc>
-          <w:tcPr>
-            <w:tcW w:type="dxa" w:w="3231"/>
-          </w:tcPr>
-          <w:p>
-            <w:pPr>
-              <w:spacing w:after="40"/>
-            </w:pPr>
-            <w:r>
-              <w:rPr>
-                <w:b w:val="0"/>
-                <w:sz w:val="20"/>
-              </w:rPr>
-              <w:t>Muestra de países</w:t>
-            </w:r>
-          </w:p>
-        </w:tc>
-        <w:tc>
-          <w:tcPr>
-            <w:tcW w:type="dxa" w:w="1361"/>
-          </w:tcPr>
-          <w:p>
-            <w:pPr>
-              <w:spacing w:after="40"/>
-            </w:pPr>
-            <w:r>
-              <w:rPr>
-                <w:b w:val="0"/>
-                <w:sz w:val="20"/>
-              </w:rPr>
-              <w:t>1.7</w:t>
-            </w:r>
-          </w:p>
-        </w:tc>
-        <w:tc>
-          <w:tcPr>
-            <w:tcW w:type="dxa" w:w="4309"/>
-          </w:tcPr>
-          <w:p>
-            <w:pPr>
-              <w:spacing w:after="40"/>
-            </w:pPr>
-            <w:r>
-              <w:rPr>
-                <w:b w:val="0"/>
-                <w:sz w:val="20"/>
-              </w:rPr>
               <w:t>Excluir países de menos de 1 millón de habitantes o con exportaciones muy bajas, y reportar el filtro.</w:t>
             </w:r>
           </w:p>
         </w:tc>
       </w:tr>
       <w:tr>
+        <w:trPr>
+          <w:cantSplit w:val="true"/>
+        </w:trPr>
         <w:tc>
           <w:tcPr>
             <w:tcW w:type="dxa" w:w="737"/>
-            <w:shd w:val="clear" w:color="auto" w:fill="F2F2F2"/>
           </w:tcPr>
           <w:p>
             <w:pPr>
@@ -1009,7 +1176,6 @@
         <w:tc>
           <w:tcPr>
             <w:tcW w:type="dxa" w:w="3231"/>
-            <w:shd w:val="clear" w:color="auto" w:fill="F2F2F2"/>
           </w:tcPr>
           <w:p>
             <w:pPr>
@@ -1027,7 +1193,6 @@
         <w:tc>
           <w:tcPr>
             <w:tcW w:type="dxa" w:w="1361"/>
-            <w:shd w:val="clear" w:color="auto" w:fill="F2F2F2"/>
           </w:tcPr>
           <w:p>
             <w:pPr>
@@ -1045,7 +1210,6 @@
         <w:tc>
           <w:tcPr>
             <w:tcW w:type="dxa" w:w="4309"/>
-            <w:shd w:val="clear" w:color="auto" w:fill="F2F2F2"/>
           </w:tcPr>
           <w:p>
             <w:pPr>
@@ -1062,9 +1226,13 @@
         </w:tc>
       </w:tr>
       <w:tr>
+        <w:trPr>
+          <w:cantSplit w:val="true"/>
+        </w:trPr>
         <w:tc>
           <w:tcPr>
             <w:tcW w:type="dxa" w:w="737"/>
+            <w:shd w:val="clear" w:color="auto" w:fill="F2F2F2"/>
           </w:tcPr>
           <w:p>
             <w:pPr>
@@ -1082,6 +1250,7 @@
         <w:tc>
           <w:tcPr>
             <w:tcW w:type="dxa" w:w="3231"/>
+            <w:shd w:val="clear" w:color="auto" w:fill="F2F2F2"/>
           </w:tcPr>
           <w:p>
             <w:pPr>
@@ -1099,6 +1268,7 @@
         <w:tc>
           <w:tcPr>
             <w:tcW w:type="dxa" w:w="1361"/>
+            <w:shd w:val="clear" w:color="auto" w:fill="F2F2F2"/>
           </w:tcPr>
           <w:p>
             <w:pPr>
@@ -1116,6 +1286,7 @@
         <w:tc>
           <w:tcPr>
             <w:tcW w:type="dxa" w:w="4309"/>
+            <w:shd w:val="clear" w:color="auto" w:fill="F2F2F2"/>
           </w:tcPr>
           <w:p>
             <w:pPr>
@@ -1142,15 +1313,7 @@
         <w:rPr>
           <w:b w:val="0"/>
         </w:rPr>
-        <w:t>D10 (umbral ε de las reglas de política) se deja abierto hasta tener los resultados de la Fase 3.</w:t>
-      </w:r>
-    </w:p>
-    <w:p>
-      <w:r>
-        <w:rPr>
-          <w:b w:val="0"/>
-        </w:rPr>
-        <w:t>Ya decididas: D5 (HS92; 4 dígitos para estimar y 6 para el puente), D9 (sectores a partir de CIIU Rev.4), D11 (las carreras del MEC se vinculan a CIIU y no a HS) y D12 (unidad común: división CIIU de 2 dígitos).</w:t>
+        <w:t>D10 (umbral ε de las reglas de política) se deja abierto hasta la Fase 3.</w:t>
       </w:r>
     </w:p>
     <w:p>
@@ -1158,649 +1321,7 @@
         <w:pStyle w:val="Heading1"/>
       </w:pPr>
       <w:r>
-        <w:t>5. Camino completo de la Fase 1</w:t>
-      </w:r>
-    </w:p>
-    <w:tbl>
-      <w:tblPr>
-        <w:tblStyle w:val="TableGrid"/>
-        <w:tblW w:type="auto" w:w="0"/>
-        <w:jc w:val="center"/>
-        <w:tblLayout w:type="fixed"/>
-        <w:tblLook w:firstColumn="1" w:firstRow="1" w:lastColumn="0" w:lastRow="0" w:noHBand="0" w:noVBand="1" w:val="04A0"/>
-      </w:tblPr>
-      <w:tblGrid>
-        <w:gridCol w:w="3213"/>
-        <w:gridCol w:w="3213"/>
-        <w:gridCol w:w="3213"/>
-      </w:tblGrid>
-      <w:tr>
-        <w:trPr>
-          <w:tblHeader w:val="true"/>
-        </w:trPr>
-        <w:tc>
-          <w:tcPr>
-            <w:tcW w:type="dxa" w:w="1247"/>
-            <w:shd w:val="clear" w:color="auto" w:fill="1F4E79"/>
-          </w:tcPr>
-          <w:p>
-            <w:pPr>
-              <w:spacing w:after="40"/>
-            </w:pPr>
-            <w:r>
-              <w:rPr>
-                <w:b/>
-                <w:color w:val="FFFFFF"/>
-                <w:sz w:val="20"/>
-              </w:rPr>
-              <w:t>Tarea</w:t>
-            </w:r>
-          </w:p>
-        </w:tc>
-        <w:tc>
-          <w:tcPr>
-            <w:tcW w:type="dxa" w:w="6236"/>
-            <w:shd w:val="clear" w:color="auto" w:fill="1F4E79"/>
-          </w:tcPr>
-          <w:p>
-            <w:pPr>
-              <w:spacing w:after="40"/>
-            </w:pPr>
-            <w:r>
-              <w:rPr>
-                <w:b/>
-                <w:color w:val="FFFFFF"/>
-                <w:sz w:val="20"/>
-              </w:rPr>
-              <w:t>Qué produce</w:t>
-            </w:r>
-          </w:p>
-        </w:tc>
-        <w:tc>
-          <w:tcPr>
-            <w:tcW w:type="dxa" w:w="2154"/>
-            <w:shd w:val="clear" w:color="auto" w:fill="1F4E79"/>
-          </w:tcPr>
-          <w:p>
-            <w:pPr>
-              <w:spacing w:after="40"/>
-            </w:pPr>
-            <w:r>
-              <w:rPr>
-                <w:b/>
-                <w:color w:val="FFFFFF"/>
-                <w:sz w:val="20"/>
-              </w:rPr>
-              <w:t>Decisiones</w:t>
-            </w:r>
-          </w:p>
-        </w:tc>
-      </w:tr>
-      <w:tr>
-        <w:tc>
-          <w:tcPr>
-            <w:tcW w:type="dxa" w:w="1247"/>
-          </w:tcPr>
-          <w:p>
-            <w:pPr>
-              <w:spacing w:after="40"/>
-            </w:pPr>
-            <w:r>
-              <w:rPr>
-                <w:b/>
-                <w:sz w:val="20"/>
-              </w:rPr>
-              <w:t>1.1</w:t>
-            </w:r>
-          </w:p>
-        </w:tc>
-        <w:tc>
-          <w:tcPr>
-            <w:tcW w:type="dxa" w:w="6236"/>
-          </w:tcPr>
-          <w:p>
-            <w:pPr>
-              <w:spacing w:after="40"/>
-            </w:pPr>
-            <w:r>
-              <w:rPr>
-                <w:b w:val="0"/>
-                <w:sz w:val="20"/>
-              </w:rPr>
-              <w:t>Limpieza de BACI</w:t>
-            </w:r>
-          </w:p>
-        </w:tc>
-        <w:tc>
-          <w:tcPr>
-            <w:tcW w:type="dxa" w:w="2154"/>
-          </w:tcPr>
-          <w:p>
-            <w:pPr>
-              <w:spacing w:after="40"/>
-            </w:pPr>
-            <w:r>
-              <w:rPr>
-                <w:b w:val="0"/>
-                <w:sz w:val="20"/>
-              </w:rPr>
-              <w:t>—</w:t>
-            </w:r>
-          </w:p>
-        </w:tc>
-      </w:tr>
-      <w:tr>
-        <w:tc>
-          <w:tcPr>
-            <w:tcW w:type="dxa" w:w="1247"/>
-            <w:shd w:val="clear" w:color="auto" w:fill="F2F2F2"/>
-          </w:tcPr>
-          <w:p>
-            <w:pPr>
-              <w:spacing w:after="40"/>
-            </w:pPr>
-            <w:r>
-              <w:rPr>
-                <w:b/>
-                <w:sz w:val="20"/>
-              </w:rPr>
-              <w:t>1.2</w:t>
-            </w:r>
-          </w:p>
-        </w:tc>
-        <w:tc>
-          <w:tcPr>
-            <w:tcW w:type="dxa" w:w="6236"/>
-            <w:shd w:val="clear" w:color="auto" w:fill="F2F2F2"/>
-          </w:tcPr>
-          <w:p>
-            <w:pPr>
-              <w:spacing w:after="40"/>
-            </w:pPr>
-            <w:r>
-              <w:rPr>
-                <w:b w:val="0"/>
-                <w:sz w:val="20"/>
-              </w:rPr>
-              <w:t>Depuración: excluir la energía de Itaipú y Yacyretá (HS 271600) y marcar las reexportaciones</w:t>
-            </w:r>
-          </w:p>
-        </w:tc>
-        <w:tc>
-          <w:tcPr>
-            <w:tcW w:type="dxa" w:w="2154"/>
-            <w:shd w:val="clear" w:color="auto" w:fill="F2F2F2"/>
-          </w:tcPr>
-          <w:p>
-            <w:pPr>
-              <w:spacing w:after="40"/>
-            </w:pPr>
-            <w:r>
-              <w:rPr>
-                <w:b w:val="0"/>
-                <w:sz w:val="20"/>
-              </w:rPr>
-              <w:t>D6</w:t>
-            </w:r>
-          </w:p>
-        </w:tc>
-      </w:tr>
-      <w:tr>
-        <w:tc>
-          <w:tcPr>
-            <w:tcW w:type="dxa" w:w="1247"/>
-          </w:tcPr>
-          <w:p>
-            <w:pPr>
-              <w:spacing w:after="40"/>
-            </w:pPr>
-            <w:r>
-              <w:rPr>
-                <w:b/>
-                <w:sz w:val="20"/>
-              </w:rPr>
-              <w:t>1.3</w:t>
-            </w:r>
-          </w:p>
-        </w:tc>
-        <w:tc>
-          <w:tcPr>
-            <w:tcW w:type="dxa" w:w="6236"/>
-          </w:tcPr>
-          <w:p>
-            <w:pPr>
-              <w:spacing w:after="40"/>
-            </w:pPr>
-            <w:r>
-              <w:rPr>
-                <w:b w:val="0"/>
-                <w:sz w:val="20"/>
-              </w:rPr>
-              <w:t>RCA y matriz de presencia</w:t>
-            </w:r>
-          </w:p>
-        </w:tc>
-        <w:tc>
-          <w:tcPr>
-            <w:tcW w:type="dxa" w:w="2154"/>
-          </w:tcPr>
-          <w:p>
-            <w:pPr>
-              <w:spacing w:after="40"/>
-            </w:pPr>
-            <w:r>
-              <w:rPr>
-                <w:b w:val="0"/>
-                <w:sz w:val="20"/>
-              </w:rPr>
-              <w:t>—</w:t>
-            </w:r>
-          </w:p>
-        </w:tc>
-      </w:tr>
-      <w:tr>
-        <w:tc>
-          <w:tcPr>
-            <w:tcW w:type="dxa" w:w="1247"/>
-            <w:shd w:val="clear" w:color="auto" w:fill="F2F2F2"/>
-          </w:tcPr>
-          <w:p>
-            <w:pPr>
-              <w:spacing w:after="40"/>
-            </w:pPr>
-            <w:r>
-              <w:rPr>
-                <w:b/>
-                <w:sz w:val="20"/>
-              </w:rPr>
-              <w:t>1.4</w:t>
-            </w:r>
-          </w:p>
-        </w:tc>
-        <w:tc>
-          <w:tcPr>
-            <w:tcW w:type="dxa" w:w="6236"/>
-            <w:shd w:val="clear" w:color="auto" w:fill="F2F2F2"/>
-          </w:tcPr>
-          <w:p>
-            <w:pPr>
-              <w:spacing w:after="40"/>
-            </w:pPr>
-            <w:r>
-              <w:rPr>
-                <w:b w:val="0"/>
-                <w:sz w:val="20"/>
-              </w:rPr>
-              <w:t>Proximidad y densidad sin fuga de información</w:t>
-            </w:r>
-          </w:p>
-        </w:tc>
-        <w:tc>
-          <w:tcPr>
-            <w:tcW w:type="dxa" w:w="2154"/>
-            <w:shd w:val="clear" w:color="auto" w:fill="F2F2F2"/>
-          </w:tcPr>
-          <w:p>
-            <w:pPr>
-              <w:spacing w:after="40"/>
-            </w:pPr>
-            <w:r>
-              <w:rPr>
-                <w:b w:val="0"/>
-                <w:sz w:val="20"/>
-              </w:rPr>
-              <w:t>D3</w:t>
-            </w:r>
-          </w:p>
-        </w:tc>
-      </w:tr>
-      <w:tr>
-        <w:tc>
-          <w:tcPr>
-            <w:tcW w:type="dxa" w:w="1247"/>
-          </w:tcPr>
-          <w:p>
-            <w:pPr>
-              <w:spacing w:after="40"/>
-            </w:pPr>
-            <w:r>
-              <w:rPr>
-                <w:b/>
-                <w:sz w:val="20"/>
-              </w:rPr>
-              <w:t>1.5 y 1.6</w:t>
-            </w:r>
-          </w:p>
-        </w:tc>
-        <w:tc>
-          <w:tcPr>
-            <w:tcW w:type="dxa" w:w="6236"/>
-          </w:tcPr>
-          <w:p>
-            <w:pPr>
-              <w:spacing w:after="40"/>
-            </w:pPr>
-            <w:r>
-              <w:rPr>
-                <w:b w:val="0"/>
-                <w:sz w:val="20"/>
-              </w:rPr>
-              <w:t>Dotaciones por país y requisitos por producto</w:t>
-            </w:r>
-          </w:p>
-        </w:tc>
-        <w:tc>
-          <w:tcPr>
-            <w:tcW w:type="dxa" w:w="2154"/>
-          </w:tcPr>
-          <w:p>
-            <w:pPr>
-              <w:spacing w:after="40"/>
-            </w:pPr>
-            <w:r>
-              <w:rPr>
-                <w:b w:val="0"/>
-                <w:sz w:val="20"/>
-              </w:rPr>
-              <w:t>D4</w:t>
-            </w:r>
-          </w:p>
-        </w:tc>
-      </w:tr>
-      <w:tr>
-        <w:tc>
-          <w:tcPr>
-            <w:tcW w:type="dxa" w:w="1247"/>
-            <w:shd w:val="clear" w:color="auto" w:fill="F2F2F2"/>
-          </w:tcPr>
-          <w:p>
-            <w:pPr>
-              <w:spacing w:after="40"/>
-            </w:pPr>
-            <w:r>
-              <w:rPr>
-                <w:b/>
-                <w:sz w:val="20"/>
-              </w:rPr>
-              <w:t>1.7</w:t>
-            </w:r>
-          </w:p>
-        </w:tc>
-        <w:tc>
-          <w:tcPr>
-            <w:tcW w:type="dxa" w:w="6236"/>
-            <w:shd w:val="clear" w:color="auto" w:fill="F2F2F2"/>
-          </w:tcPr>
-          <w:p>
-            <w:pPr>
-              <w:spacing w:after="40"/>
-            </w:pPr>
-            <w:r>
-              <w:rPr>
-                <w:b w:val="0"/>
-                <w:sz w:val="20"/>
-              </w:rPr>
-              <w:t>Panel de entradas (ventanas 2000→2005→2010→2015→2020, h = 5 y 10)</w:t>
-            </w:r>
-          </w:p>
-        </w:tc>
-        <w:tc>
-          <w:tcPr>
-            <w:tcW w:type="dxa" w:w="2154"/>
-            <w:shd w:val="clear" w:color="auto" w:fill="F2F2F2"/>
-          </w:tcPr>
-          <w:p>
-            <w:pPr>
-              <w:spacing w:after="40"/>
-            </w:pPr>
-            <w:r>
-              <w:rPr>
-                <w:b w:val="0"/>
-                <w:sz w:val="20"/>
-              </w:rPr>
-              <w:t>D7, D8</w:t>
-            </w:r>
-          </w:p>
-        </w:tc>
-      </w:tr>
-      <w:tr>
-        <w:tc>
-          <w:tcPr>
-            <w:tcW w:type="dxa" w:w="1247"/>
-          </w:tcPr>
-          <w:p>
-            <w:pPr>
-              <w:spacing w:after="40"/>
-            </w:pPr>
-            <w:r>
-              <w:rPr>
-                <w:b/>
-                <w:sz w:val="20"/>
-              </w:rPr>
-              <w:t>1.8</w:t>
-            </w:r>
-          </w:p>
-        </w:tc>
-        <w:tc>
-          <w:tcPr>
-            <w:tcW w:type="dxa" w:w="6236"/>
-          </w:tcPr>
-          <w:p>
-            <w:pPr>
-              <w:spacing w:after="40"/>
-            </w:pPr>
-            <w:r>
-              <w:rPr>
-                <w:b w:val="0"/>
-                <w:sz w:val="20"/>
-              </w:rPr>
-              <w:t>Modelo de referencia: solo densidad</w:t>
-            </w:r>
-          </w:p>
-        </w:tc>
-        <w:tc>
-          <w:tcPr>
-            <w:tcW w:type="dxa" w:w="2154"/>
-          </w:tcPr>
-          <w:p>
-            <w:pPr>
-              <w:spacing w:after="40"/>
-            </w:pPr>
-            <w:r>
-              <w:rPr>
-                <w:b w:val="0"/>
-                <w:sz w:val="20"/>
-              </w:rPr>
-              <w:t>—</w:t>
-            </w:r>
-          </w:p>
-        </w:tc>
-      </w:tr>
-      <w:tr>
-        <w:tc>
-          <w:tcPr>
-            <w:tcW w:type="dxa" w:w="1247"/>
-            <w:shd w:val="clear" w:color="auto" w:fill="F2F2F2"/>
-          </w:tcPr>
-          <w:p>
-            <w:pPr>
-              <w:spacing w:after="40"/>
-            </w:pPr>
-            <w:r>
-              <w:rPr>
-                <w:b/>
-                <w:sz w:val="20"/>
-              </w:rPr>
-              <w:t>1.9</w:t>
-            </w:r>
-          </w:p>
-        </w:tc>
-        <w:tc>
-          <w:tcPr>
-            <w:tcW w:type="dxa" w:w="6236"/>
-            <w:shd w:val="clear" w:color="auto" w:fill="F2F2F2"/>
-          </w:tcPr>
-          <w:p>
-            <w:pPr>
-              <w:spacing w:after="40"/>
-            </w:pPr>
-            <w:r>
-              <w:rPr>
-                <w:b w:val="0"/>
-                <w:sz w:val="20"/>
-              </w:rPr>
-              <w:t>Logit con capas y efectos fijos</w:t>
-            </w:r>
-          </w:p>
-        </w:tc>
-        <w:tc>
-          <w:tcPr>
-            <w:tcW w:type="dxa" w:w="2154"/>
-            <w:shd w:val="clear" w:color="auto" w:fill="F2F2F2"/>
-          </w:tcPr>
-          <w:p>
-            <w:pPr>
-              <w:spacing w:after="40"/>
-            </w:pPr>
-            <w:r>
-              <w:rPr>
-                <w:b w:val="0"/>
-                <w:sz w:val="20"/>
-              </w:rPr>
-              <w:t>D2</w:t>
-            </w:r>
-          </w:p>
-        </w:tc>
-      </w:tr>
-      <w:tr>
-        <w:tc>
-          <w:tcPr>
-            <w:tcW w:type="dxa" w:w="1247"/>
-          </w:tcPr>
-          <w:p>
-            <w:pPr>
-              <w:spacing w:after="40"/>
-            </w:pPr>
-            <w:r>
-              <w:rPr>
-                <w:b/>
-                <w:sz w:val="20"/>
-              </w:rPr>
-              <w:t>1.10</w:t>
-            </w:r>
-          </w:p>
-        </w:tc>
-        <w:tc>
-          <w:tcPr>
-            <w:tcW w:type="dxa" w:w="6236"/>
-          </w:tcPr>
-          <w:p>
-            <w:pPr>
-              <w:spacing w:after="40"/>
-            </w:pPr>
-            <w:r>
-              <w:rPr>
-                <w:b w:val="0"/>
-                <w:sz w:val="20"/>
-              </w:rPr>
-              <w:t>XGBoost de control con SHAP</w:t>
-            </w:r>
-          </w:p>
-        </w:tc>
-        <w:tc>
-          <w:tcPr>
-            <w:tcW w:type="dxa" w:w="2154"/>
-          </w:tcPr>
-          <w:p>
-            <w:pPr>
-              <w:spacing w:after="40"/>
-            </w:pPr>
-            <w:r>
-              <w:rPr>
-                <w:b w:val="0"/>
-                <w:sz w:val="20"/>
-              </w:rPr>
-              <w:t>—</w:t>
-            </w:r>
-          </w:p>
-        </w:tc>
-      </w:tr>
-      <w:tr>
-        <w:tc>
-          <w:tcPr>
-            <w:tcW w:type="dxa" w:w="1247"/>
-            <w:shd w:val="clear" w:color="auto" w:fill="F2F2F2"/>
-          </w:tcPr>
-          <w:p>
-            <w:pPr>
-              <w:spacing w:after="40"/>
-            </w:pPr>
-            <w:r>
-              <w:rPr>
-                <w:b/>
-                <w:sz w:val="20"/>
-              </w:rPr>
-              <w:t>1.11</w:t>
-            </w:r>
-          </w:p>
-        </w:tc>
-        <w:tc>
-          <w:tcPr>
-            <w:tcW w:type="dxa" w:w="6236"/>
-            <w:shd w:val="clear" w:color="auto" w:fill="F2F2F2"/>
-          </w:tcPr>
-          <w:p>
-            <w:pPr>
-              <w:spacing w:after="40"/>
-            </w:pPr>
-            <w:r>
-              <w:rPr>
-                <w:b w:val="0"/>
-                <w:sz w:val="20"/>
-              </w:rPr>
-              <w:t>Backtest y validación; informe de la Fase 1</w:t>
-            </w:r>
-          </w:p>
-        </w:tc>
-        <w:tc>
-          <w:tcPr>
-            <w:tcW w:type="dxa" w:w="2154"/>
-            <w:shd w:val="clear" w:color="auto" w:fill="F2F2F2"/>
-          </w:tcPr>
-          <w:p>
-            <w:pPr>
-              <w:spacing w:after="40"/>
-            </w:pPr>
-            <w:r>
-              <w:rPr>
-                <w:b w:val="0"/>
-                <w:sz w:val="20"/>
-              </w:rPr>
-              <w:t>D1</w:t>
-            </w:r>
-          </w:p>
-        </w:tc>
-      </w:tr>
-    </w:tbl>
-    <w:p>
-      <w:pPr>
-        <w:spacing w:after="40"/>
-      </w:pPr>
-    </w:p>
-    <w:p>
-      <w:r>
-        <w:rPr>
-          <w:b w:val="0"/>
-        </w:rPr>
-        <w:t>Condición para pasar a la Fase 2: el modelo con capas supera a la densidad sola en precision@k. Los resultados se leen como asociación, no como causalidad, y siempre con su incertidumbre.</w:t>
-      </w:r>
-    </w:p>
-    <w:p>
-      <w:pPr>
-        <w:pStyle w:val="Heading1"/>
-      </w:pPr>
-      <w:r>
-        <w:t>6. En paralelo: datos de la Fase 2 (territorial)</w:t>
+        <w:t>5. Hallazgos que hay que resolver</w:t>
       </w:r>
     </w:p>
     <w:p>
@@ -1809,7 +1330,7 @@
         <w:spacing w:after="60"/>
       </w:pPr>
       <w:r>
-        <w:t>Registro de títulos y Registro Nacional de Carreras del MEC: los consigue Joaquín. Después hay que definir carrera → CINE-F → sector. El registro de títulos trae nombres y documentos de personas: se trabaja solo con agregados y no se sube a ningún lado.</w:t>
+        <w:t>Capital humano, crédito y logística están muy correlacionadas entre sí (0,65 a 0,76); la energía (precio) es independiente. Decidir en la tarea 1.9 cómo tratarlo.</w:t>
       </w:r>
     </w:p>
     <w:p>
@@ -1818,7 +1339,7 @@
         <w:spacing w:after="60"/>
       </w:pPr>
       <w:r>
-        <w:t>Reconciliar los 247 distritos de los límites de 2012 con los 263 del Censo 2022. Hoy las industrias, subestaciones y rutas usan los límites viejos, y la población y el censo agropecuario usan los nuevos.</w:t>
+        <w:t>Agricultura, minería y servicios no tienen requisitos (NBER-CES es solo manufactura): 13 % del valor mundial, incluida la soja en grano. Decidir cómo tratarlos en el modelo y en el módulo territorial.</w:t>
       </w:r>
     </w:p>
     <w:p>
@@ -1827,7 +1348,7 @@
         <w:spacing w:after="60"/>
       </w:pPr>
       <w:r>
-        <w:t>Serie histórica de crédito más larga y datos de crédito por actividad, si se consiguen.</w:t>
+        <w:t>depurar.py quita la energía y las reexportaciones pero no recalcula el RCA: el RCA de los demás productos de Paraguay queda subestimado (la energía es el 23 % de sus exportaciones).</w:t>
       </w:r>
     </w:p>
     <w:p>
@@ -1836,7 +1357,7 @@
         <w:spacing w:after="60"/>
       </w:pPr>
       <w:r>
-        <w:t>Informes de maquila y de la Ley de Inversiones: última capa, como complemento y no como serie.</w:t>
+        <w:t>El precio de la electricidad solo existe para 2014-2019: en la robustez, repetir el modelo con las ventanas desde 2015.</w:t>
       </w:r>
     </w:p>
     <w:p>
@@ -1844,7 +1365,7 @@
         <w:pStyle w:val="Heading1"/>
       </w:pPr>
       <w:r>
-        <w:t>7. Pendientes de datos (Joaquín)</w:t>
+        <w:t>6. Datos pendientes (Joaquín)</w:t>
       </w:r>
     </w:p>
     <w:tbl>
@@ -1897,12 +1418,15 @@
                 <w:color w:val="FFFFFF"/>
                 <w:sz w:val="20"/>
               </w:rPr>
-              <w:t>Cómo se consigue</w:t>
+              <w:t>Estado</w:t>
             </w:r>
           </w:p>
         </w:tc>
       </w:tr>
       <w:tr>
+        <w:trPr>
+          <w:cantSplit w:val="true"/>
+        </w:trPr>
         <w:tc>
           <w:tcPr>
             <w:tcW w:type="dxa" w:w="4535"/>
@@ -1916,7 +1440,7 @@
                 <w:b/>
                 <w:sz w:val="20"/>
               </w:rPr>
-              <w:t>Registro de títulos y de carreras del MEC</w:t>
+              <w:t>Registro de títulos del MEC</w:t>
             </w:r>
           </w:p>
         </w:tc>
@@ -1933,16 +1457,59 @@
                 <w:b w:val="0"/>
                 <w:sz w:val="20"/>
               </w:rPr>
-              <w:t>Descarga manual desde el portal del MEC (rechaza scripts).</w:t>
+              <w:t>Solicitud formal enviada el 12/10 (agregado, sin datos personales). Plazo de respuesta: 2/11.</w:t>
             </w:r>
           </w:p>
         </w:tc>
       </w:tr>
       <w:tr>
+        <w:trPr>
+          <w:cantSplit w:val="true"/>
+        </w:trPr>
         <w:tc>
           <w:tcPr>
             <w:tcW w:type="dxa" w:w="4535"/>
             <w:shd w:val="clear" w:color="auto" w:fill="F2F2F2"/>
+          </w:tcPr>
+          <w:p>
+            <w:pPr>
+              <w:spacing w:after="40"/>
+            </w:pPr>
+            <w:r>
+              <w:rPr>
+                <w:b/>
+                <w:sz w:val="20"/>
+              </w:rPr>
+              <w:t>Registro Nacional de Carreras del MEC</w:t>
+            </w:r>
+          </w:p>
+        </w:tc>
+        <w:tc>
+          <w:tcPr>
+            <w:tcW w:type="dxa" w:w="5102"/>
+            <w:shd w:val="clear" w:color="auto" w:fill="F2F2F2"/>
+          </w:tcPr>
+          <w:p>
+            <w:pPr>
+              <w:spacing w:after="40"/>
+            </w:pPr>
+            <w:r>
+              <w:rPr>
+                <w:b w:val="0"/>
+                <w:sz w:val="20"/>
+              </w:rPr>
+              <w:t>Descarga manual; el sitio rechaza scripts.</w:t>
+            </w:r>
+          </w:p>
+        </w:tc>
+      </w:tr>
+      <w:tr>
+        <w:trPr>
+          <w:cantSplit w:val="true"/>
+        </w:trPr>
+        <w:tc>
+          <w:tcPr>
+            <w:tcW w:type="dxa" w:w="4535"/>
           </w:tcPr>
           <w:p>
             <w:pPr>
@@ -1960,7 +1527,6 @@
         <w:tc>
           <w:tcPr>
             <w:tcW w:type="dxa" w:w="5102"/>
-            <w:shd w:val="clear" w:color="auto" w:fill="F2F2F2"/>
           </w:tcPr>
           <w:p>
             <w:pPr>
@@ -1977,9 +1543,13 @@
         </w:tc>
       </w:tr>
       <w:tr>
+        <w:trPr>
+          <w:cantSplit w:val="true"/>
+        </w:trPr>
         <w:tc>
           <w:tcPr>
             <w:tcW w:type="dxa" w:w="4535"/>
+            <w:shd w:val="clear" w:color="auto" w:fill="F2F2F2"/>
           </w:tcPr>
           <w:p>
             <w:pPr>
@@ -1997,6 +1567,7 @@
         <w:tc>
           <w:tcPr>
             <w:tcW w:type="dxa" w:w="5102"/>
+            <w:shd w:val="clear" w:color="auto" w:fill="F2F2F2"/>
           </w:tcPr>
           <w:p>
             <w:pPr>
@@ -2013,10 +1584,12 @@
         </w:tc>
       </w:tr>
       <w:tr>
+        <w:trPr>
+          <w:cantSplit w:val="true"/>
+        </w:trPr>
         <w:tc>
           <w:tcPr>
             <w:tcW w:type="dxa" w:w="4535"/>
-            <w:shd w:val="clear" w:color="auto" w:fill="F2F2F2"/>
           </w:tcPr>
           <w:p>
             <w:pPr>
@@ -2034,7 +1607,6 @@
         <w:tc>
           <w:tcPr>
             <w:tcW w:type="dxa" w:w="5102"/>
-            <w:shd w:val="clear" w:color="auto" w:fill="F2F2F2"/>
           </w:tcPr>
           <w:p>
             <w:pPr>
@@ -2051,9 +1623,13 @@
         </w:tc>
       </w:tr>
       <w:tr>
+        <w:trPr>
+          <w:cantSplit w:val="true"/>
+        </w:trPr>
         <w:tc>
           <w:tcPr>
             <w:tcW w:type="dxa" w:w="4535"/>
+            <w:shd w:val="clear" w:color="auto" w:fill="F2F2F2"/>
           </w:tcPr>
           <w:p>
             <w:pPr>
@@ -2071,6 +1647,7 @@
         <w:tc>
           <w:tcPr>
             <w:tcW w:type="dxa" w:w="5102"/>
+            <w:shd w:val="clear" w:color="auto" w:fill="F2F2F2"/>
           </w:tcPr>
           <w:p>
             <w:pPr>
@@ -2087,44 +1664,9 @@
         </w:tc>
       </w:tr>
       <w:tr>
-        <w:tc>
-          <w:tcPr>
-            <w:tcW w:type="dxa" w:w="4535"/>
-            <w:shd w:val="clear" w:color="auto" w:fill="F2F2F2"/>
-          </w:tcPr>
-          <w:p>
-            <w:pPr>
-              <w:spacing w:after="40"/>
-            </w:pPr>
-            <w:r>
-              <w:rPr>
-                <w:b/>
-                <w:sz w:val="20"/>
-              </w:rPr>
-              <w:t>Año de las cifras de aduanas y autoría de la MIP</w:t>
-            </w:r>
-          </w:p>
-        </w:tc>
-        <w:tc>
-          <w:tcPr>
-            <w:tcW w:type="dxa" w:w="5102"/>
-            <w:shd w:val="clear" w:color="auto" w:fill="F2F2F2"/>
-          </w:tcPr>
-          <w:p>
-            <w:pPr>
-              <w:spacing w:after="40"/>
-            </w:pPr>
-            <w:r>
-              <w:rPr>
-                <w:b w:val="0"/>
-                <w:sz w:val="20"/>
-              </w:rPr>
-              <w:t>Confirmar con el MIC y con el BCP.</w:t>
-            </w:r>
-          </w:p>
-        </w:tc>
-      </w:tr>
-      <w:tr>
+        <w:trPr>
+          <w:cantSplit w:val="true"/>
+        </w:trPr>
         <w:tc>
           <w:tcPr>
             <w:tcW w:type="dxa" w:w="4535"/>
@@ -2138,7 +1680,7 @@
                 <w:b/>
                 <w:sz w:val="20"/>
               </w:rPr>
-              <w:t>Licencias de SIMEL y del visor del MIC</w:t>
+              <w:t>Licencias de BACI, Atlas, SIMEL y del visor del MIC; año de las aduanas; autoría de la MIP</w:t>
             </w:r>
           </w:p>
         </w:tc>
@@ -2167,11 +1709,258 @@
       </w:pPr>
     </w:p>
     <w:p>
+      <w:r>
+        <w:rPr>
+          <w:b w:val="0"/>
+        </w:rPr>
+        <w:t>En paralelo, para la Fase 2: reconciliar los 247 distritos de los límites de 2012 con los 263 del Censo 2022 y definir carrera → CINE-F → sector cuando lleguen los títulos.</w:t>
+      </w:r>
+    </w:p>
+    <w:p>
       <w:pPr>
         <w:pStyle w:val="Heading1"/>
       </w:pPr>
       <w:r>
-        <w:t>8. Reparto sugerido</w:t>
+        <w:t>7. Rendimiento: bases DuckDB y modelos</w:t>
+      </w:r>
+    </w:p>
+    <w:p>
+      <w:r>
+        <w:rPr>
+          <w:b w:val="0"/>
+        </w:rPr>
+        <w:t>El cálculo de la densidad en SQL generaba unos 1.600 millones de filas por ventana, y el logit con efectos fijos de statsmodels arma una matriz densa de 14 a 16 GB: el disco de Ever perdió unos 60 GB. Medido con datos reales, las versiones livianas lo evitan:</w:t>
+      </w:r>
+    </w:p>
+    <w:tbl>
+      <w:tblPr>
+        <w:tblStyle w:val="TableGrid"/>
+        <w:tblW w:type="auto" w:w="0"/>
+        <w:jc w:val="center"/>
+        <w:tblLayout w:type="fixed"/>
+        <w:tblLook w:firstColumn="1" w:firstRow="1" w:lastColumn="0" w:lastRow="0" w:noHBand="0" w:noVBand="1" w:val="04A0"/>
+      </w:tblPr>
+      <w:tblGrid>
+        <w:gridCol w:w="3213"/>
+        <w:gridCol w:w="3213"/>
+        <w:gridCol w:w="3213"/>
+      </w:tblGrid>
+      <w:tr>
+        <w:trPr>
+          <w:tblHeader w:val="true"/>
+        </w:trPr>
+        <w:tc>
+          <w:tcPr>
+            <w:tcW w:type="dxa" w:w="2835"/>
+            <w:shd w:val="clear" w:color="auto" w:fill="1F4E79"/>
+          </w:tcPr>
+          <w:p>
+            <w:pPr>
+              <w:spacing w:after="40"/>
+            </w:pPr>
+            <w:r>
+              <w:rPr>
+                <w:b/>
+                <w:color w:val="FFFFFF"/>
+                <w:sz w:val="20"/>
+              </w:rPr>
+              <w:t>Versión liviana</w:t>
+            </w:r>
+          </w:p>
+        </w:tc>
+        <w:tc>
+          <w:tcPr>
+            <w:tcW w:type="dxa" w:w="2835"/>
+            <w:shd w:val="clear" w:color="auto" w:fill="1F4E79"/>
+          </w:tcPr>
+          <w:p>
+            <w:pPr>
+              <w:spacing w:after="40"/>
+            </w:pPr>
+            <w:r>
+              <w:rPr>
+                <w:b/>
+                <w:color w:val="FFFFFF"/>
+                <w:sz w:val="20"/>
+              </w:rPr>
+              <w:t>Reemplaza</w:t>
+            </w:r>
+          </w:p>
+        </w:tc>
+        <w:tc>
+          <w:tcPr>
+            <w:tcW w:type="dxa" w:w="3969"/>
+            <w:shd w:val="clear" w:color="auto" w:fill="1F4E79"/>
+          </w:tcPr>
+          <w:p>
+            <w:pPr>
+              <w:spacing w:after="40"/>
+            </w:pPr>
+            <w:r>
+              <w:rPr>
+                <w:b/>
+                <w:color w:val="FFFFFF"/>
+                <w:sz w:val="20"/>
+              </w:rPr>
+              <w:t>Resultado (ventana real)</w:t>
+            </w:r>
+          </w:p>
+        </w:tc>
+      </w:tr>
+      <w:tr>
+        <w:trPr>
+          <w:cantSplit w:val="true"/>
+        </w:trPr>
+        <w:tc>
+          <w:tcPr>
+            <w:tcW w:type="dxa" w:w="2835"/>
+          </w:tcPr>
+          <w:p>
+            <w:pPr>
+              <w:spacing w:after="40"/>
+            </w:pPr>
+            <w:r>
+              <w:rPr>
+                <w:b/>
+                <w:sz w:val="20"/>
+              </w:rPr>
+              <w:t>src/modelos/densidad_np.py</w:t>
+            </w:r>
+          </w:p>
+        </w:tc>
+        <w:tc>
+          <w:tcPr>
+            <w:tcW w:type="dxa" w:w="2835"/>
+          </w:tcPr>
+          <w:p>
+            <w:pPr>
+              <w:spacing w:after="40"/>
+            </w:pPr>
+            <w:r>
+              <w:rPr>
+                <w:b w:val="0"/>
+                <w:sz w:val="20"/>
+              </w:rPr>
+              <w:t>la densidad en SQL</w:t>
+            </w:r>
+          </w:p>
+        </w:tc>
+        <w:tc>
+          <w:tcPr>
+            <w:tcW w:type="dxa" w:w="3969"/>
+          </w:tcPr>
+          <w:p>
+            <w:pPr>
+              <w:spacing w:after="40"/>
+            </w:pPr>
+            <w:r>
+              <w:rPr>
+                <w:b w:val="0"/>
+                <w:sz w:val="20"/>
+              </w:rPr>
+              <w:t>3,7 segundos y 490 MB; idéntica a la versión SQL</w:t>
+            </w:r>
+          </w:p>
+        </w:tc>
+      </w:tr>
+      <w:tr>
+        <w:trPr>
+          <w:cantSplit w:val="true"/>
+        </w:trPr>
+        <w:tc>
+          <w:tcPr>
+            <w:tcW w:type="dxa" w:w="2835"/>
+            <w:shd w:val="clear" w:color="auto" w:fill="F2F2F2"/>
+          </w:tcPr>
+          <w:p>
+            <w:pPr>
+              <w:spacing w:after="40"/>
+            </w:pPr>
+            <w:r>
+              <w:rPr>
+                <w:b/>
+                <w:sz w:val="20"/>
+              </w:rPr>
+              <w:t>src/modelos/logit_disperso.py</w:t>
+            </w:r>
+          </w:p>
+        </w:tc>
+        <w:tc>
+          <w:tcPr>
+            <w:tcW w:type="dxa" w:w="2835"/>
+            <w:shd w:val="clear" w:color="auto" w:fill="F2F2F2"/>
+          </w:tcPr>
+          <w:p>
+            <w:pPr>
+              <w:spacing w:after="40"/>
+            </w:pPr>
+            <w:r>
+              <w:rPr>
+                <w:b w:val="0"/>
+                <w:sz w:val="20"/>
+              </w:rPr>
+              <w:t>el logit de statsmodels</w:t>
+            </w:r>
+          </w:p>
+        </w:tc>
+        <w:tc>
+          <w:tcPr>
+            <w:tcW w:type="dxa" w:w="3969"/>
+            <w:shd w:val="clear" w:color="auto" w:fill="F2F2F2"/>
+          </w:tcPr>
+          <w:p>
+            <w:pPr>
+              <w:spacing w:after="40"/>
+            </w:pPr>
+            <w:r>
+              <w:rPr>
+                <w:b w:val="0"/>
+                <w:sz w:val="20"/>
+              </w:rPr>
+              <w:t>37 segundos y 400 MB (en vez de unos 16 GB)</w:t>
+            </w:r>
+          </w:p>
+        </w:tc>
+      </w:tr>
+    </w:tbl>
+    <w:p>
+      <w:pPr>
+        <w:spacing w:after="40"/>
+      </w:pPr>
+    </w:p>
+    <w:p>
+      <w:pPr>
+        <w:pStyle w:val="ListBullet"/>
+        <w:spacing w:after="60"/>
+      </w:pPr>
+      <w:r>
+        <w:t>Las bases .duckdb no se suben a Git ni a un servidor (Railway, Cloudflare): solo las tablas resultado en parquet.</w:t>
+      </w:r>
+    </w:p>
+    <w:p>
+      <w:pPr>
+        <w:pStyle w:val="ListBullet"/>
+        <w:spacing w:after="60"/>
+      </w:pPr>
+      <w:r>
+        <w:t>Las rutas de la base se pasan por parámetro, no fijas en el código (hoy hay rutas C:\ever\... y dos copias de la base).</w:t>
+      </w:r>
+    </w:p>
+    <w:p>
+      <w:pPr>
+        <w:pStyle w:val="ListBullet"/>
+        <w:spacing w:after="60"/>
+      </w:pPr>
+      <w:r>
+        <w:t>Cómo recuperar espacio en el disco: docs/optimizacion_modelos.md.</w:t>
+      </w:r>
+    </w:p>
+    <w:p>
+      <w:pPr>
+        <w:pStyle w:val="Heading1"/>
+      </w:pPr>
+      <w:r>
+        <w:t>8. Reparto de tareas</w:t>
       </w:r>
     </w:p>
     <w:p>
@@ -2183,10 +1972,10 @@
         <w:rPr>
           <w:b/>
         </w:rPr>
-        <w:t xml:space="preserve">Tu socio: </w:t>
+        <w:t xml:space="preserve">Ever: </w:t>
       </w:r>
       <w:r>
-        <w:t>tareas 1.1, 1.3 y 1.8. Son código puro, no esperan decisiones y desbloquean todo lo demás.</w:t>
+        <w:t>pasa sus módulos a densidad_np.py y logit_disperso.py, recalcula el RCA después de depurar, aplica la depuración a la presencia y la densidad, saca las rutas fijas y sube los cambios con pruebas.</w:t>
       </w:r>
     </w:p>
     <w:p>
@@ -2198,10 +1987,25 @@
         <w:rPr>
           <w:b/>
         </w:rPr>
-        <w:t xml:space="preserve">Joaquín con Claude Code: </w:t>
+        <w:t xml:space="preserve">Joaquín: </w:t>
       </w:r>
       <w:r>
-        <w:t>decisiones D4, D6 y D3, que son las que más trancan al resto; después, los datos pendientes de la sección 7.</w:t>
+        <w:t>decide D7 y D8 con Ever, consigue los datos pendientes de la sección 6.</w:t>
+      </w:r>
+    </w:p>
+    <w:p>
+      <w:pPr>
+        <w:pStyle w:val="ListBullet"/>
+        <w:spacing w:after="60"/>
+      </w:pPr>
+      <w:r>
+        <w:rPr>
+          <w:b/>
+        </w:rPr>
+        <w:t xml:space="preserve">Claude Code: </w:t>
+      </w:r>
+      <w:r>
+        <w:t>hechas la 1.5, la 1.6 y las versiones livianas. Siguiente: revisar los módulos de Ever contra D3, D5 y D6 cuando los suba.</w:t>
       </w:r>
     </w:p>
     <w:p>
@@ -2216,7 +2020,7 @@
         <w:t xml:space="preserve">Reglas de trabajo: </w:t>
       </w:r>
       <w:r>
-        <w:t>una tarea por rama (por ejemplo fase1/1-1-limpieza-baci), pruebas y lint en verde antes de cada commit, pull request revisado por la otra persona, y no editar nunca data/raw/.</w:t>
+        <w:t>una tarea por rama (por ejemplo fase1/1-1-limpieza-baci), pruebas y lint en verde antes de cada commit, pull request revisado por la otra persona, no editar nunca data/raw/ y los archivos existentes de src/modelos/ los modifica solo quien trabaja ese módulo.</w:t>
       </w:r>
     </w:p>
     <w:p>

</xml_diff>

<commit_message>
Decisiones D7 (entrada de un solo anio, robustez 2 de 3) y D8 (poblacion y exportaciones minimas)
Co-Authored-By: Claude Sonnet 5.5 <noreply@anthropic.com>
</commit_message>
<xml_diff>
--- a/docs/TAPE_pasos_siguientes.docx
+++ b/docs/TAPE_pasos_siguientes.docx
@@ -80,7 +80,7 @@
         <w:spacing w:after="60"/>
       </w:pPr>
       <w:r>
-        <w:t>Fuentes nacionales ya incorporadas: PIB por 33 actividades y regional (BCP), crédito por sector, MIP de 21 sectores, EPHC 2022–2025, censo agropecuario 2022 (por departamento y por distrito), carreras de la ANEAES, establecimientos del MEC y siete capas del mapa logístico del MIC.</w:t>
+        <w:t>Fuentes nacionales incorporadas: BCP (PIB y crédito), MIP de 21 sectores, EPHC 2022–2025, censo agropecuario 2022, carreras de la ANEAES, datos del MEC y siete capas del mapa logístico del MIC.</w:t>
       </w:r>
     </w:p>
     <w:p>
@@ -98,7 +98,7 @@
         <w:spacing w:after="60"/>
       </w:pPr>
       <w:r>
-        <w:t>Decisiones tomadas el 12 de octubre: D3 (proximidad con ventana de 5 años), D4 (intensidades con NBER-CES y energía con el precio de la electricidad) y D6 (reexportaciones marcadas por regla automática).</w:t>
+        <w:t>Decisiones tomadas el 12 de octubre: D3 (proximidad con ventana de 5 años), D4 (intensidades con NBER-CES y energía con el precio de la electricidad), D6 (reexportaciones marcadas por regla automática), D7 (entrada de un solo año, con «2 de 3 años» como robustez) y D8 (población ≥ 1 millón y exportaciones ≥ USD 1.000 millones).</w:t>
       </w:r>
     </w:p>
     <w:p>
@@ -461,7 +461,7 @@
                 <w:b w:val="0"/>
                 <w:sz w:val="20"/>
               </w:rPr>
-              <w:t>Contrastar con el RCA del Atlas; D7 sin decidir</w:t>
+              <w:t>Contrastar con el RCA del Atlas; confirmar la presencia usada para la densidad</w:t>
             </w:r>
           </w:p>
         </w:tc>
@@ -691,7 +691,7 @@
                 <w:b w:val="0"/>
                 <w:sz w:val="20"/>
               </w:rPr>
-              <w:t>D7 y D8 sin decidir; sus constantes de D8 no se aplican</w:t>
+              <w:t>Aplicar D7 (entrada de un solo año y variante «2 de 3 años») y D8 (filtro de países); decidir qué hacer con la logística en 2000 y 2005</w:t>
             </w:r>
           </w:p>
         </w:tc>
@@ -890,6 +890,36 @@
         <w:rPr>
           <w:b/>
         </w:rPr>
+        <w:t xml:space="preserve">D7: </w:t>
+      </w:r>
+      <w:r>
+        <w:t>la entrada principal es la del documento técnico (un solo año); la robustez exige RCA ≥ 1 en 2 de los 3 años finales. Se descartó el promedio móvil de 3 años: solo el 32 % de sus entradas se sostiene dos años después (39 % con un solo año, 47 % con «2 de 3»).</w:t>
+      </w:r>
+    </w:p>
+    <w:p>
+      <w:pPr>
+        <w:pStyle w:val="ListBullet"/>
+        <w:spacing w:after="60"/>
+      </w:pPr>
+      <w:r>
+        <w:rPr>
+          <w:b/>
+        </w:rPr>
+        <w:t xml:space="preserve">D8: </w:t>
+      </w:r>
+      <w:r>
+        <w:t>países con población ≥ 1 millón y exportaciones ≥ USD 1.000 millones en el año inicial: 112 a 144 países y cerca del 97 % del comercio mundial. Paraguay entra en todas las ventanas.</w:t>
+      </w:r>
+    </w:p>
+    <w:p>
+      <w:pPr>
+        <w:pStyle w:val="ListBullet"/>
+        <w:spacing w:after="60"/>
+      </w:pPr>
+      <w:r>
+        <w:rPr>
+          <w:b/>
+        </w:rPr>
         <w:t xml:space="preserve">Decididas antes: </w:t>
       </w:r>
       <w:r>
@@ -998,156 +1028,6 @@
                 <w:sz w:val="20"/>
               </w:rPr>
               <w:t>Recomendación</w:t>
-            </w:r>
-          </w:p>
-        </w:tc>
-      </w:tr>
-      <w:tr>
-        <w:trPr>
-          <w:cantSplit w:val="true"/>
-        </w:trPr>
-        <w:tc>
-          <w:tcPr>
-            <w:tcW w:type="dxa" w:w="737"/>
-          </w:tcPr>
-          <w:p>
-            <w:pPr>
-              <w:spacing w:after="40"/>
-            </w:pPr>
-            <w:r>
-              <w:rPr>
-                <w:b/>
-                <w:sz w:val="20"/>
-              </w:rPr>
-              <w:t>D7</w:t>
-            </w:r>
-          </w:p>
-        </w:tc>
-        <w:tc>
-          <w:tcPr>
-            <w:tcW w:type="dxa" w:w="3231"/>
-          </w:tcPr>
-          <w:p>
-            <w:pPr>
-              <w:spacing w:after="40"/>
-            </w:pPr>
-            <w:r>
-              <w:rPr>
-                <w:b w:val="0"/>
-                <w:sz w:val="20"/>
-              </w:rPr>
-              <w:t>Definición de entrada sostenida</w:t>
-            </w:r>
-          </w:p>
-        </w:tc>
-        <w:tc>
-          <w:tcPr>
-            <w:tcW w:type="dxa" w:w="1361"/>
-          </w:tcPr>
-          <w:p>
-            <w:pPr>
-              <w:spacing w:after="40"/>
-            </w:pPr>
-            <w:r>
-              <w:rPr>
-                <w:b w:val="0"/>
-                <w:sz w:val="20"/>
-              </w:rPr>
-              <w:t>1.7</w:t>
-            </w:r>
-          </w:p>
-        </w:tc>
-        <w:tc>
-          <w:tcPr>
-            <w:tcW w:type="dxa" w:w="4309"/>
-          </w:tcPr>
-          <w:p>
-            <w:pPr>
-              <w:spacing w:after="40"/>
-            </w:pPr>
-            <w:r>
-              <w:rPr>
-                <w:b w:val="0"/>
-                <w:sz w:val="20"/>
-              </w:rPr>
-              <w:t>RCA con promedio móvil de 3 años, y una variante que exige RCA ≥ 1 en dos de tres años. Ever ya implementó la primera.</w:t>
-            </w:r>
-          </w:p>
-        </w:tc>
-      </w:tr>
-      <w:tr>
-        <w:trPr>
-          <w:cantSplit w:val="true"/>
-        </w:trPr>
-        <w:tc>
-          <w:tcPr>
-            <w:tcW w:type="dxa" w:w="737"/>
-            <w:shd w:val="clear" w:color="auto" w:fill="F2F2F2"/>
-          </w:tcPr>
-          <w:p>
-            <w:pPr>
-              <w:spacing w:after="40"/>
-            </w:pPr>
-            <w:r>
-              <w:rPr>
-                <w:b/>
-                <w:sz w:val="20"/>
-              </w:rPr>
-              <w:t>D8</w:t>
-            </w:r>
-          </w:p>
-        </w:tc>
-        <w:tc>
-          <w:tcPr>
-            <w:tcW w:type="dxa" w:w="3231"/>
-            <w:shd w:val="clear" w:color="auto" w:fill="F2F2F2"/>
-          </w:tcPr>
-          <w:p>
-            <w:pPr>
-              <w:spacing w:after="40"/>
-            </w:pPr>
-            <w:r>
-              <w:rPr>
-                <w:b w:val="0"/>
-                <w:sz w:val="20"/>
-              </w:rPr>
-              <w:t>Muestra de países</w:t>
-            </w:r>
-          </w:p>
-        </w:tc>
-        <w:tc>
-          <w:tcPr>
-            <w:tcW w:type="dxa" w:w="1361"/>
-            <w:shd w:val="clear" w:color="auto" w:fill="F2F2F2"/>
-          </w:tcPr>
-          <w:p>
-            <w:pPr>
-              <w:spacing w:after="40"/>
-            </w:pPr>
-            <w:r>
-              <w:rPr>
-                <w:b w:val="0"/>
-                <w:sz w:val="20"/>
-              </w:rPr>
-              <w:t>1.7</w:t>
-            </w:r>
-          </w:p>
-        </w:tc>
-        <w:tc>
-          <w:tcPr>
-            <w:tcW w:type="dxa" w:w="4309"/>
-            <w:shd w:val="clear" w:color="auto" w:fill="F2F2F2"/>
-          </w:tcPr>
-          <w:p>
-            <w:pPr>
-              <w:spacing w:after="40"/>
-            </w:pPr>
-            <w:r>
-              <w:rPr>
-                <w:b w:val="0"/>
-                <w:sz w:val="20"/>
-              </w:rPr>
-              <w:t>Excluir países de menos de 1 millón de habitantes o con exportaciones muy bajas, y reportar el filtro.</w:t>
             </w:r>
           </w:p>
         </w:tc>
@@ -1357,7 +1237,7 @@
         <w:spacing w:after="60"/>
       </w:pPr>
       <w:r>
-        <w:t>El precio de la electricidad solo existe para 2014-2019: en la robustez, repetir el modelo con las ventanas desde 2015.</w:t>
+        <w:t>El precio de la electricidad solo existe para 2014-2019: en la robustez, usar las ventanas desde 2015. La logística no existe antes de 2007: decidir cómo estimar las ventanas de 2000 y 2005.</w:t>
       </w:r>
     </w:p>
     <w:p>
@@ -1975,7 +1855,7 @@
         <w:t xml:space="preserve">Ever: </w:t>
       </w:r>
       <w:r>
-        <w:t>pasa sus módulos a densidad_np.py y logit_disperso.py, recalcula el RCA después de depurar, aplica la depuración a la presencia y la densidad, saca las rutas fijas y sube los cambios con pruebas.</w:t>
+        <w:t>pasa sus módulos a densidad_np.py y logit_disperso.py, recalcula el RCA después de depurar, aplica la depuración a la presencia y la densidad, aplica D7 y D8 en el panel, saca las rutas fijas y sube los cambios con pruebas.</w:t>
       </w:r>
     </w:p>
     <w:p>
@@ -1990,7 +1870,7 @@
         <w:t xml:space="preserve">Joaquín: </w:t>
       </w:r>
       <w:r>
-        <w:t>decide D7 y D8 con Ever, consigue los datos pendientes de la sección 6.</w:t>
+        <w:t>consigue los datos pendientes de la sección 6 y decide D2 cuando lleguemos al logit.</w:t>
       </w:r>
     </w:p>
     <w:p>
@@ -2046,7 +1926,7 @@
         <w:spacing w:after="60"/>
       </w:pPr>
       <w:r>
-        <w:t>Los datos del visor del MIC vienen de una página pública sin licencia declarada: son provisorios y de uso interno hasta tener la entrega oficial.</w:t>
+        <w:t>Los datos del visor del MIC no tienen licencia declarada: son provisorios y de uso interno.</w:t>
       </w:r>
     </w:p>
     <w:sectPr>
@@ -2450,11 +2330,11 @@
     <w:qFormat/>
     <w:rsid w:val="00FC693F"/>
     <w:pPr>
-      <w:spacing w:after="120"/>
+      <w:spacing w:after="100"/>
     </w:pPr>
     <w:rPr>
       <w:rFonts w:ascii="Calibri" w:hAnsi="Calibri" w:eastAsia="Calibri"/>
-      <w:sz w:val="22"/>
+      <w:sz w:val="21"/>
     </w:rPr>
   </w:style>
   <w:style w:type="paragraph" w:styleId="Header">

</xml_diff>